<commit_message>
IT2 - review items
</commit_message>
<xml_diff>
--- a/src/site/pdfs/it2_u1_s5_p2_chart_practice_letter.docx
+++ b/src/site/pdfs/it2_u1_s5_p2_chart_practice_letter.docx
@@ -83,7 +83,23 @@
           <w:iCs/>
           <w:color w:val="000000" w:themeColor="text1"/>
         </w:rPr>
-        <w:t>B smith</w:t>
+        <w:t xml:space="preserve">B </w:t>
+      </w:r>
+      <w:r>
+        <w:rPr>
+          <w:rFonts w:ascii="Arial" w:hAnsi="Arial" w:cs="Arial"/>
+          <w:iCs/>
+          <w:color w:val="000000" w:themeColor="text1"/>
+        </w:rPr>
+        <w:t>S</w:t>
+      </w:r>
+      <w:r>
+        <w:rPr>
+          <w:rFonts w:ascii="Arial" w:hAnsi="Arial" w:cs="Arial"/>
+          <w:iCs/>
+          <w:color w:val="000000" w:themeColor="text1"/>
+        </w:rPr>
+        <w:t>mith</w:t>
       </w:r>
     </w:p>
     <w:p>
@@ -140,7 +156,7 @@
           <w:iCs/>
           <w:color w:val="000000" w:themeColor="text1"/>
         </w:rPr>
-        <w:t>NR 1 1AA</w:t>
+        <w:t>NR1 1AA</w:t>
       </w:r>
     </w:p>
     <w:p>
@@ -163,6 +179,28 @@
     <w:p>
       <w:pPr>
         <w:rPr>
+          <w:iCs/>
+          <w:color w:val="000000" w:themeColor="text1"/>
+        </w:rPr>
+      </w:pPr>
+    </w:p>
+    <w:p>
+      <w:pPr>
+        <w:spacing w:line="360" w:lineRule="auto"/>
+        <w:jc w:val="both"/>
+        <w:rPr>
+          <w:rFonts w:ascii="Arial" w:hAnsi="Arial" w:cs="Arial"/>
+          <w:iCs/>
+          <w:color w:val="000000" w:themeColor="text1"/>
+        </w:rPr>
+      </w:pPr>
+    </w:p>
+    <w:p>
+      <w:pPr>
+        <w:spacing w:line="360" w:lineRule="auto"/>
+        <w:jc w:val="both"/>
+        <w:rPr>
+          <w:rFonts w:ascii="Arial" w:hAnsi="Arial" w:cs="Arial"/>
           <w:iCs/>
           <w:color w:val="000000" w:themeColor="text1"/>
         </w:rPr>

</xml_diff>